<commit_message>
Deploying to gh-pages from @ MinSuan96/minsuan96.github.io@d066391b33c2967079eb4340124c3907e773c026 🚀
</commit_message>
<xml_diff>
--- a/assets/docx/cv.docx
+++ b/assets/docx/cv.docx
@@ -23,7 +23,13 @@
         <w:jc w:val="center"/>
       </w:pPr>
       <w:r>
-        <w:t xml:space="preserve">minsuan1104@hotmail.com | https://minsuan96.github.io/ | +60129525568 </w:t>
+        <w:t>minsuan1104@hotmail.com | https://minsuan96.github.io/</w:t>
+      </w:r>
+      <w:r>
+        <w:t>portfolio/</w:t>
+      </w:r>
+      <w:r>
+        <w:t xml:space="preserve"> | +60129525568 </w:t>
       </w:r>
     </w:p>
     <w:tbl>

</xml_diff>